<commit_message>
fidelity: figure retitled 'HGS-M5 vs. M4G (Small Scale)'; M5-λ comparison dropped from bundle (not in thesis)
</commit_message>
<xml_diff>
--- a/experiments/formal/2026-09-18_small_pure_m5_vs_m4g_fidelity/csv/apa_tables.docx
+++ b/experiments/formal/2026-09-18_small_pure_m5_vs_m4g_fidelity/csv/apa_tables.docx
@@ -4391,550 +4391,6 @@
             <w:tcBorders>
               <w:top w:val="nil"/>
               <w:left w:val="nil"/>
-              <w:bottom w:val="nil"/>
-              <w:right w:val="nil"/>
-            </w:tcBorders>
-          </w:tcPr>
-          <w:p>
-            <w:r>
-              <w:rPr>
-                <w:rFonts w:ascii="Times New Roman" w:hAnsi="Times New Roman"/>
-                <w:sz w:val="18"/>
-              </w:rPr>
-              <w:t>m5_pure_6b</w:t>
-            </w:r>
-          </w:p>
-        </w:tc>
-        <w:tc>
-          <w:tcPr>
-            <w:tcW w:type="dxa" w:w="1020"/>
-            <w:tcBorders>
-              <w:top w:val="nil"/>
-              <w:left w:val="nil"/>
-              <w:bottom w:val="nil"/>
-              <w:right w:val="nil"/>
-            </w:tcBorders>
-          </w:tcPr>
-          <w:p>
-            <w:r>
-              <w:rPr>
-                <w:rFonts w:ascii="Times New Roman" w:hAnsi="Times New Roman"/>
-                <w:sz w:val="18"/>
-              </w:rPr>
-              <w:t>m5_lambda_6b</w:t>
-            </w:r>
-          </w:p>
-        </w:tc>
-        <w:tc>
-          <w:tcPr>
-            <w:tcW w:type="dxa" w:w="1020"/>
-            <w:tcBorders>
-              <w:top w:val="nil"/>
-              <w:left w:val="nil"/>
-              <w:bottom w:val="nil"/>
-              <w:right w:val="nil"/>
-            </w:tcBorders>
-          </w:tcPr>
-          <w:p>
-            <w:pPr>
-              <w:jc w:val="right"/>
-            </w:pPr>
-            <w:r>
-              <w:rPr>
-                <w:rFonts w:ascii="Times New Roman" w:hAnsi="Times New Roman"/>
-                <w:sz w:val="18"/>
-              </w:rPr>
-              <w:t>−0.08</w:t>
-            </w:r>
-          </w:p>
-        </w:tc>
-        <w:tc>
-          <w:tcPr>
-            <w:tcW w:type="dxa" w:w="1020"/>
-            <w:tcBorders>
-              <w:top w:val="nil"/>
-              <w:left w:val="nil"/>
-              <w:bottom w:val="nil"/>
-              <w:right w:val="nil"/>
-            </w:tcBorders>
-          </w:tcPr>
-          <w:p>
-            <w:pPr>
-              <w:jc w:val="right"/>
-            </w:pPr>
-            <w:r>
-              <w:rPr>
-                <w:rFonts w:ascii="Times New Roman" w:hAnsi="Times New Roman"/>
-                <w:sz w:val="18"/>
-              </w:rPr>
-              <w:t>−0.03</w:t>
-            </w:r>
-          </w:p>
-        </w:tc>
-        <w:tc>
-          <w:tcPr>
-            <w:tcW w:type="dxa" w:w="1020"/>
-            <w:tcBorders>
-              <w:top w:val="nil"/>
-              <w:left w:val="nil"/>
-              <w:bottom w:val="nil"/>
-              <w:right w:val="nil"/>
-            </w:tcBorders>
-          </w:tcPr>
-          <w:p>
-            <w:pPr>
-              <w:jc w:val="right"/>
-            </w:pPr>
-            <w:r>
-              <w:rPr>
-                <w:rFonts w:ascii="Times New Roman" w:hAnsi="Times New Roman"/>
-                <w:sz w:val="18"/>
-              </w:rPr>
-              <w:t>+1.54**</w:t>
-            </w:r>
-          </w:p>
-        </w:tc>
-        <w:tc>
-          <w:tcPr>
-            <w:tcW w:type="dxa" w:w="1020"/>
-            <w:tcBorders>
-              <w:top w:val="nil"/>
-              <w:left w:val="nil"/>
-              <w:bottom w:val="nil"/>
-              <w:right w:val="nil"/>
-            </w:tcBorders>
-          </w:tcPr>
-          <w:p>
-            <w:pPr>
-              <w:jc w:val="right"/>
-            </w:pPr>
-            <w:r>
-              <w:rPr>
-                <w:rFonts w:ascii="Times New Roman" w:hAnsi="Times New Roman"/>
-                <w:sz w:val="18"/>
-              </w:rPr>
-              <w:t>+12.29***</w:t>
-            </w:r>
-          </w:p>
-        </w:tc>
-        <w:tc>
-          <w:tcPr>
-            <w:tcW w:type="dxa" w:w="1020"/>
-            <w:tcBorders>
-              <w:top w:val="nil"/>
-              <w:left w:val="nil"/>
-              <w:bottom w:val="nil"/>
-              <w:right w:val="nil"/>
-            </w:tcBorders>
-          </w:tcPr>
-          <w:p>
-            <w:pPr>
-              <w:jc w:val="right"/>
-            </w:pPr>
-            <w:r>
-              <w:rPr>
-                <w:rFonts w:ascii="Times New Roman" w:hAnsi="Times New Roman"/>
-                <w:sz w:val="18"/>
-              </w:rPr>
-              <w:t>−9.58***</w:t>
-            </w:r>
-          </w:p>
-        </w:tc>
-        <w:tc>
-          <w:tcPr>
-            <w:tcW w:type="dxa" w:w="1020"/>
-            <w:tcBorders>
-              <w:top w:val="nil"/>
-              <w:left w:val="nil"/>
-              <w:bottom w:val="nil"/>
-              <w:right w:val="nil"/>
-            </w:tcBorders>
-          </w:tcPr>
-          <w:p>
-            <w:pPr>
-              <w:jc w:val="right"/>
-            </w:pPr>
-            <w:r>
-              <w:rPr>
-                <w:rFonts w:ascii="Times New Roman" w:hAnsi="Times New Roman"/>
-                <w:sz w:val="18"/>
-              </w:rPr>
-              <w:t>−10.94***</w:t>
-            </w:r>
-          </w:p>
-        </w:tc>
-        <w:tc>
-          <w:tcPr>
-            <w:tcW w:type="dxa" w:w="1020"/>
-            <w:tcBorders>
-              <w:top w:val="nil"/>
-              <w:left w:val="nil"/>
-              <w:bottom w:val="nil"/>
-              <w:right w:val="nil"/>
-            </w:tcBorders>
-          </w:tcPr>
-          <w:p>
-            <w:pPr>
-              <w:jc w:val="right"/>
-            </w:pPr>
-            <w:r>
-              <w:rPr>
-                <w:rFonts w:ascii="Times New Roman" w:hAnsi="Times New Roman"/>
-                <w:sz w:val="18"/>
-              </w:rPr>
-              <w:t>−0.03</w:t>
-            </w:r>
-          </w:p>
-        </w:tc>
-        <w:tc>
-          <w:tcPr>
-            <w:tcW w:type="dxa" w:w="1020"/>
-            <w:tcBorders>
-              <w:top w:val="nil"/>
-              <w:left w:val="nil"/>
-              <w:bottom w:val="nil"/>
-              <w:right w:val="nil"/>
-            </w:tcBorders>
-          </w:tcPr>
-          <w:p>
-            <w:pPr>
-              <w:jc w:val="right"/>
-            </w:pPr>
-            <w:r>
-              <w:rPr>
-                <w:rFonts w:ascii="Times New Roman" w:hAnsi="Times New Roman"/>
-                <w:sz w:val="18"/>
-              </w:rPr>
-              <w:t>−3.19*</w:t>
-            </w:r>
-          </w:p>
-        </w:tc>
-        <w:tc>
-          <w:tcPr>
-            <w:tcW w:type="dxa" w:w="1020"/>
-            <w:tcBorders>
-              <w:top w:val="nil"/>
-              <w:left w:val="nil"/>
-              <w:bottom w:val="nil"/>
-              <w:right w:val="nil"/>
-            </w:tcBorders>
-          </w:tcPr>
-          <w:p>
-            <w:pPr>
-              <w:jc w:val="right"/>
-            </w:pPr>
-            <w:r>
-              <w:rPr>
-                <w:rFonts w:ascii="Times New Roman" w:hAnsi="Times New Roman"/>
-                <w:sz w:val="18"/>
-              </w:rPr>
-              <w:t>−2.86</w:t>
-            </w:r>
-          </w:p>
-        </w:tc>
-        <w:tc>
-          <w:tcPr>
-            <w:tcW w:type="dxa" w:w="1020"/>
-            <w:tcBorders>
-              <w:top w:val="nil"/>
-              <w:left w:val="nil"/>
-              <w:bottom w:val="nil"/>
-              <w:right w:val="nil"/>
-            </w:tcBorders>
-          </w:tcPr>
-          <w:p>
-            <w:pPr>
-              <w:jc w:val="right"/>
-            </w:pPr>
-            <w:r>
-              <w:rPr>
-                <w:rFonts w:ascii="Times New Roman" w:hAnsi="Times New Roman"/>
-                <w:sz w:val="18"/>
-              </w:rPr>
-              <w:t>+7.31</w:t>
-            </w:r>
-          </w:p>
-        </w:tc>
-      </w:tr>
-      <w:tr>
-        <w:tc>
-          <w:tcPr>
-            <w:tcW w:type="dxa" w:w="1020"/>
-            <w:tcBorders>
-              <w:top w:val="nil"/>
-              <w:left w:val="nil"/>
-              <w:bottom w:val="nil"/>
-              <w:right w:val="nil"/>
-            </w:tcBorders>
-          </w:tcPr>
-          <w:p>
-            <w:r>
-              <w:rPr>
-                <w:rFonts w:ascii="Times New Roman" w:hAnsi="Times New Roman"/>
-                <w:sz w:val="18"/>
-              </w:rPr>
-              <w:t>m5_pure_10b</w:t>
-            </w:r>
-          </w:p>
-        </w:tc>
-        <w:tc>
-          <w:tcPr>
-            <w:tcW w:type="dxa" w:w="1020"/>
-            <w:tcBorders>
-              <w:top w:val="nil"/>
-              <w:left w:val="nil"/>
-              <w:bottom w:val="nil"/>
-              <w:right w:val="nil"/>
-            </w:tcBorders>
-          </w:tcPr>
-          <w:p>
-            <w:r>
-              <w:rPr>
-                <w:rFonts w:ascii="Times New Roman" w:hAnsi="Times New Roman"/>
-                <w:sz w:val="18"/>
-              </w:rPr>
-              <w:t>m4g_10b</w:t>
-            </w:r>
-          </w:p>
-        </w:tc>
-        <w:tc>
-          <w:tcPr>
-            <w:tcW w:type="dxa" w:w="1020"/>
-            <w:tcBorders>
-              <w:top w:val="nil"/>
-              <w:left w:val="nil"/>
-              <w:bottom w:val="nil"/>
-              <w:right w:val="nil"/>
-            </w:tcBorders>
-          </w:tcPr>
-          <w:p>
-            <w:pPr>
-              <w:jc w:val="right"/>
-            </w:pPr>
-            <w:r>
-              <w:rPr>
-                <w:rFonts w:ascii="Times New Roman" w:hAnsi="Times New Roman"/>
-                <w:sz w:val="18"/>
-              </w:rPr>
-              <w:t>−0.01</w:t>
-            </w:r>
-          </w:p>
-        </w:tc>
-        <w:tc>
-          <w:tcPr>
-            <w:tcW w:type="dxa" w:w="1020"/>
-            <w:tcBorders>
-              <w:top w:val="nil"/>
-              <w:left w:val="nil"/>
-              <w:bottom w:val="nil"/>
-              <w:right w:val="nil"/>
-            </w:tcBorders>
-          </w:tcPr>
-          <w:p>
-            <w:pPr>
-              <w:jc w:val="right"/>
-            </w:pPr>
-            <w:r>
-              <w:rPr>
-                <w:rFonts w:ascii="Times New Roman" w:hAnsi="Times New Roman"/>
-                <w:sz w:val="18"/>
-              </w:rPr>
-              <w:t>−1.50**</w:t>
-            </w:r>
-          </w:p>
-        </w:tc>
-        <w:tc>
-          <w:tcPr>
-            <w:tcW w:type="dxa" w:w="1020"/>
-            <w:tcBorders>
-              <w:top w:val="nil"/>
-              <w:left w:val="nil"/>
-              <w:bottom w:val="nil"/>
-              <w:right w:val="nil"/>
-            </w:tcBorders>
-          </w:tcPr>
-          <w:p>
-            <w:pPr>
-              <w:jc w:val="right"/>
-            </w:pPr>
-            <w:r>
-              <w:rPr>
-                <w:rFonts w:ascii="Times New Roman" w:hAnsi="Times New Roman"/>
-                <w:sz w:val="18"/>
-              </w:rPr>
-              <w:t>−1.59*</w:t>
-            </w:r>
-          </w:p>
-        </w:tc>
-        <w:tc>
-          <w:tcPr>
-            <w:tcW w:type="dxa" w:w="1020"/>
-            <w:tcBorders>
-              <w:top w:val="nil"/>
-              <w:left w:val="nil"/>
-              <w:bottom w:val="nil"/>
-              <w:right w:val="nil"/>
-            </w:tcBorders>
-          </w:tcPr>
-          <w:p>
-            <w:pPr>
-              <w:jc w:val="right"/>
-            </w:pPr>
-            <w:r>
-              <w:rPr>
-                <w:rFonts w:ascii="Times New Roman" w:hAnsi="Times New Roman"/>
-                <w:sz w:val="18"/>
-              </w:rPr>
-              <w:t>+11.02***</w:t>
-            </w:r>
-          </w:p>
-        </w:tc>
-        <w:tc>
-          <w:tcPr>
-            <w:tcW w:type="dxa" w:w="1020"/>
-            <w:tcBorders>
-              <w:top w:val="nil"/>
-              <w:left w:val="nil"/>
-              <w:bottom w:val="nil"/>
-              <w:right w:val="nil"/>
-            </w:tcBorders>
-          </w:tcPr>
-          <w:p>
-            <w:pPr>
-              <w:jc w:val="right"/>
-            </w:pPr>
-            <w:r>
-              <w:rPr>
-                <w:rFonts w:ascii="Times New Roman" w:hAnsi="Times New Roman"/>
-                <w:sz w:val="18"/>
-              </w:rPr>
-              <w:t>−11.36***</w:t>
-            </w:r>
-          </w:p>
-        </w:tc>
-        <w:tc>
-          <w:tcPr>
-            <w:tcW w:type="dxa" w:w="1020"/>
-            <w:tcBorders>
-              <w:top w:val="nil"/>
-              <w:left w:val="nil"/>
-              <w:bottom w:val="nil"/>
-              <w:right w:val="nil"/>
-            </w:tcBorders>
-          </w:tcPr>
-          <w:p>
-            <w:pPr>
-              <w:jc w:val="right"/>
-            </w:pPr>
-            <w:r>
-              <w:rPr>
-                <w:rFonts w:ascii="Times New Roman" w:hAnsi="Times New Roman"/>
-                <w:sz w:val="18"/>
-              </w:rPr>
-              <w:t>−9.92***</w:t>
-            </w:r>
-          </w:p>
-        </w:tc>
-        <w:tc>
-          <w:tcPr>
-            <w:tcW w:type="dxa" w:w="1020"/>
-            <w:tcBorders>
-              <w:top w:val="nil"/>
-              <w:left w:val="nil"/>
-              <w:bottom w:val="nil"/>
-              <w:right w:val="nil"/>
-            </w:tcBorders>
-          </w:tcPr>
-          <w:p>
-            <w:pPr>
-              <w:jc w:val="right"/>
-            </w:pPr>
-            <w:r>
-              <w:rPr>
-                <w:rFonts w:ascii="Times New Roman" w:hAnsi="Times New Roman"/>
-                <w:sz w:val="18"/>
-              </w:rPr>
-              <w:t>−0.90</w:t>
-            </w:r>
-          </w:p>
-        </w:tc>
-        <w:tc>
-          <w:tcPr>
-            <w:tcW w:type="dxa" w:w="1020"/>
-            <w:tcBorders>
-              <w:top w:val="nil"/>
-              <w:left w:val="nil"/>
-              <w:bottom w:val="nil"/>
-              <w:right w:val="nil"/>
-            </w:tcBorders>
-          </w:tcPr>
-          <w:p>
-            <w:pPr>
-              <w:jc w:val="right"/>
-            </w:pPr>
-            <w:r>
-              <w:rPr>
-                <w:rFonts w:ascii="Times New Roman" w:hAnsi="Times New Roman"/>
-                <w:sz w:val="18"/>
-              </w:rPr>
-              <w:t>−2.76*</w:t>
-            </w:r>
-          </w:p>
-        </w:tc>
-        <w:tc>
-          <w:tcPr>
-            <w:tcW w:type="dxa" w:w="1020"/>
-            <w:tcBorders>
-              <w:top w:val="nil"/>
-              <w:left w:val="nil"/>
-              <w:bottom w:val="nil"/>
-              <w:right w:val="nil"/>
-            </w:tcBorders>
-          </w:tcPr>
-          <w:p>
-            <w:pPr>
-              <w:jc w:val="right"/>
-            </w:pPr>
-            <w:r>
-              <w:rPr>
-                <w:rFonts w:ascii="Times New Roman" w:hAnsi="Times New Roman"/>
-                <w:sz w:val="18"/>
-              </w:rPr>
-              <w:t>+14.52**</w:t>
-            </w:r>
-          </w:p>
-        </w:tc>
-        <w:tc>
-          <w:tcPr>
-            <w:tcW w:type="dxa" w:w="1020"/>
-            <w:tcBorders>
-              <w:top w:val="nil"/>
-              <w:left w:val="nil"/>
-              <w:bottom w:val="nil"/>
-              <w:right w:val="nil"/>
-            </w:tcBorders>
-          </w:tcPr>
-          <w:p>
-            <w:pPr>
-              <w:jc w:val="right"/>
-            </w:pPr>
-            <w:r>
-              <w:rPr>
-                <w:rFonts w:ascii="Times New Roman" w:hAnsi="Times New Roman"/>
-                <w:sz w:val="18"/>
-              </w:rPr>
-              <w:t>+1.27</w:t>
-            </w:r>
-          </w:p>
-        </w:tc>
-      </w:tr>
-      <w:tr>
-        <w:tc>
-          <w:tcPr>
-            <w:tcW w:type="dxa" w:w="1020"/>
-            <w:tcBorders>
-              <w:top w:val="nil"/>
-              <w:left w:val="nil"/>
               <w:bottom w:val="single" w:sz="8" w:color="000000"/>
               <w:right w:val="nil"/>
             </w:tcBorders>
@@ -4965,7 +4421,7 @@
                 <w:rFonts w:ascii="Times New Roman" w:hAnsi="Times New Roman"/>
                 <w:sz w:val="18"/>
               </w:rPr>
-              <w:t>m5_lambda_10b</w:t>
+              <w:t>m4g_10b</w:t>
             </w:r>
           </w:p>
         </w:tc>
@@ -4988,7 +4444,7 @@
                 <w:rFonts w:ascii="Times New Roman" w:hAnsi="Times New Roman"/>
                 <w:sz w:val="18"/>
               </w:rPr>
-              <w:t>−0.12***</w:t>
+              <w:t>−0.01</w:t>
             </w:r>
           </w:p>
         </w:tc>
@@ -5011,7 +4467,7 @@
                 <w:rFonts w:ascii="Times New Roman" w:hAnsi="Times New Roman"/>
                 <w:sz w:val="18"/>
               </w:rPr>
-              <w:t>+0.40*</w:t>
+              <w:t>−1.50**</w:t>
             </w:r>
           </w:p>
         </w:tc>
@@ -5034,7 +4490,7 @@
                 <w:rFonts w:ascii="Times New Roman" w:hAnsi="Times New Roman"/>
                 <w:sz w:val="18"/>
               </w:rPr>
-              <w:t>+0.99**</w:t>
+              <w:t>−1.59*</w:t>
             </w:r>
           </w:p>
         </w:tc>
@@ -5057,7 +4513,7 @@
                 <w:rFonts w:ascii="Times New Roman" w:hAnsi="Times New Roman"/>
                 <w:sz w:val="18"/>
               </w:rPr>
-              <w:t>+11.82***</w:t>
+              <w:t>+11.02***</w:t>
             </w:r>
           </w:p>
         </w:tc>
@@ -5080,7 +4536,7 @@
                 <w:rFonts w:ascii="Times New Roman" w:hAnsi="Times New Roman"/>
                 <w:sz w:val="18"/>
               </w:rPr>
-              <w:t>−9.67***</w:t>
+              <w:t>−11.36***</w:t>
             </w:r>
           </w:p>
         </w:tc>
@@ -5103,7 +4559,7 @@
                 <w:rFonts w:ascii="Times New Roman" w:hAnsi="Times New Roman"/>
                 <w:sz w:val="18"/>
               </w:rPr>
-              <w:t>−10.55***</w:t>
+              <w:t>−9.92***</w:t>
             </w:r>
           </w:p>
         </w:tc>
@@ -5126,7 +4582,7 @@
                 <w:rFonts w:ascii="Times New Roman" w:hAnsi="Times New Roman"/>
                 <w:sz w:val="18"/>
               </w:rPr>
-              <w:t>+0.72</w:t>
+              <w:t>−0.90</w:t>
             </w:r>
           </w:p>
         </w:tc>
@@ -5149,7 +4605,7 @@
                 <w:rFonts w:ascii="Times New Roman" w:hAnsi="Times New Roman"/>
                 <w:sz w:val="18"/>
               </w:rPr>
-              <w:t>−2.38**</w:t>
+              <w:t>−2.76*</w:t>
             </w:r>
           </w:p>
         </w:tc>
@@ -5172,7 +4628,7 @@
                 <w:rFonts w:ascii="Times New Roman" w:hAnsi="Times New Roman"/>
                 <w:sz w:val="18"/>
               </w:rPr>
-              <w:t>−5.55</w:t>
+              <w:t>+14.52**</w:t>
             </w:r>
           </w:p>
         </w:tc>
@@ -5195,7 +4651,7 @@
                 <w:rFonts w:ascii="Times New Roman" w:hAnsi="Times New Roman"/>
                 <w:sz w:val="18"/>
               </w:rPr>
-              <w:t>+17.86***</w:t>
+              <w:t>+1.27</w:t>
             </w:r>
           </w:p>
         </w:tc>

</xml_diff>